<commit_message>
informe: Fase 3 y Fase 4 con el estado real del sistema y capturas del entorno
- Fase 3 reescrita: arquitectura (lab y producción), configuración como código,
  plantillas y métricas con frecuencia, 297 triggers por severidad y
  dependencias, dashboard, widget y sus pestañas, mapa, SLA, reportería,
  alertas, validación medida (escenarios SNMP y caída troncal) y seguridad.
- Fase 4: documentación entregada. Agradecimiento a Willian Tola
  (Reportes-Zabbix) en el informe, la bibliografía y el README.
- Word fuente en docs/informe/; scripts/capturas-informe.py (Playwright).
- Widget/reporte: un AP con ping sigue siendo AP UniFi (pestaña UniFi y
  latencia); el panal no duplica el AP.
- Guía del laboratorio: caso 'Cannot load modules'.

Co-Authored-By: Claude Opus 5.5 <noreply@anthropic.com>
</commit_message>
<xml_diff>
--- a/docs/Guia del laboratorio - Red Las Lagunitas.docx
+++ b/docs/Guia del laboratorio - Red Las Lagunitas.docx
@@ -7480,6 +7480,86 @@
                 <w:sz w:val="18"/>
               </w:rPr>
               <w:t>Scan directory</w:t>
+            </w:r>
+          </w:p>
+        </w:tc>
+      </w:tr>
+      <w:tr>
+        <w:tc>
+          <w:tcPr>
+            <w:tcW w:type="dxa" w:w="3249"/>
+          </w:tcPr>
+          <w:p>
+            <w:pPr>
+              <w:spacing w:after="40"/>
+            </w:pPr>
+            <w:r>
+              <w:rPr>
+                <w:sz w:val="18"/>
+              </w:rPr>
+            </w:r>
+            <w:r>
+              <w:rPr>
+                <w:sz w:val="18"/>
+              </w:rPr>
+              <w:t xml:space="preserve">Zabbix muestra </w:t>
+            </w:r>
+            <w:r>
+              <w:rPr>
+                <w:i/>
+                <w:sz w:val="18"/>
+              </w:rPr>
+              <w:t>Cannot load modules at: modules/lagunitas-…</w:t>
+            </w:r>
+          </w:p>
+        </w:tc>
+        <w:tc>
+          <w:tcPr>
+            <w:tcW w:type="dxa" w:w="3249"/>
+          </w:tcPr>
+          <w:p>
+            <w:pPr>
+              <w:spacing w:after="40"/>
+            </w:pPr>
+            <w:r>
+              <w:rPr>
+                <w:sz w:val="18"/>
+              </w:rPr>
+            </w:r>
+            <w:r>
+              <w:rPr>
+                <w:sz w:val="18"/>
+              </w:rPr>
+              <w:t>Git reescribió las carpetas de los módulos (cambio de rama, merge) y el contenedor web quedó apuntando a las viejas</w:t>
+            </w:r>
+          </w:p>
+        </w:tc>
+        <w:tc>
+          <w:tcPr>
+            <w:tcW w:type="dxa" w:w="3249"/>
+          </w:tcPr>
+          <w:p>
+            <w:pPr>
+              <w:spacing w:after="40"/>
+            </w:pPr>
+            <w:r>
+              <w:rPr>
+                <w:sz w:val="18"/>
+              </w:rPr>
+            </w:r>
+            <w:r>
+              <w:rPr>
+                <w:rFonts w:ascii="Consolas" w:hAnsi="Consolas"/>
+                <w:color w:val="8A1C3A"/>
+                <w:sz w:val="18"/>
+              </w:rPr>
+              <w:t>docker compose up -d --force-recreate zabbix-web</w:t>
+            </w:r>
+            <w:r>
+              <w:rPr>
+                <w:sz w:val="18"/>
+              </w:rPr>
+              <w:t xml:space="preserve"> (no pierde datos)</w:t>
             </w:r>
           </w:p>
         </w:tc>

</xml_diff>